<commit_message>
Update the report now the last runbook items are done
Twenty-six of the twenty-eight are fixed rather than twenty-three, the
red flags that pointed at nothing are described in the review section,
and the checks figure is now forty-three plus the browser run.

Co-Authored-By: Claude Opus 5 <noreply@anthropic.com>
</commit_message>
<xml_diff>
--- a/docs/Spot-the-Scam-Progress-Report.docx
+++ b/docs/Spot-the-Scam-Progress-Report.docx
@@ -491,7 +491,7 @@
           <w:sz w:val="21"/>
           <w:szCs w:val="21"/>
         </w:rPr>
-        <w:t xml:space="preserve">Alongside the new work, the whole codebase was reviewed against a list of twenty-eight known issues. Twenty-three have been fixed. In plain terms, they included:</w:t>
+        <w:t xml:space="preserve">Alongside the new work, the whole codebase was reviewed against a list of twenty-eight known issues. Twenty-six have been fixed. In plain terms, they included:</w:t>
       </w:r>
     </w:p>
     <w:p>
@@ -586,6 +586,25 @@
           <w:sz w:val="21"/>
           <w:szCs w:val="21"/>
         </w:rPr>
+        <w:t xml:space="preserve">Red flags in the quiz that pointed at nothing. When the app explained what gave a fake message away, the explanation card sometimes opened over blank space instead of over the thing it was describing.</w:t>
+      </w:r>
+    </w:p>
+    <w:p>
+      <w:pPr>
+        <w:pStyle w:val="ListParagraph"/>
+        <w:numPr>
+          <w:ilvl w:val="0"/>
+          <w:numId w:val="2"/>
+        </w:numPr>
+        <w:spacing w:after="90" w:line="300"/>
+      </w:pPr>
+      <w:r>
+        <w:rPr>
+          <w:rFonts w:ascii="Calibri" w:cs="Calibri" w:eastAsia="Calibri" w:hAnsi="Calibri"/>
+          <w:color w:val="1A1A1A"/>
+          <w:sz w:val="21"/>
+          <w:szCs w:val="21"/>
+        </w:rPr>
         <w:t xml:space="preserve">Roughly a megabyte of unused images being uploaded with every release.</w:t>
       </w:r>
     </w:p>
@@ -600,7 +619,7 @@
           <w:sz w:val="21"/>
           <w:szCs w:val="21"/>
         </w:rPr>
-        <w:t xml:space="preserve">Two were deliberately left alone as too risky to change for too little gain, and three were already marked as handled by the team.</w:t>
+        <w:t xml:space="preserve">Of the two that remain, one is a piece of unfinished work now brought back in line with the live code and waiting on a translator, and one is a deliberate decision to leave well alone: refreshing the page mid-quiz starts you over, and the fix would cost more than the problem.</w:t>
       </w:r>
     </w:p>
     <w:p>
@@ -645,7 +664,7 @@
           <w:sz w:val="21"/>
           <w:szCs w:val="21"/>
         </w:rPr>
-        <w:t xml:space="preserve">There are now thirty-seven automated checks that run every single time the code changes. They test the things that fail quietly: that the quiz’s two halves stay equally difficult, that the server and the quiz agree on which answers are correct, and that the security protections have not been removed. If any check fails, the change is flagged before it can reach anyone.</w:t>
+        <w:t xml:space="preserve">There are now forty-three automated checks that run every single time the code changes. They test the things that fail quietly: that the quiz’s two halves stay equally difficult, that the server and the quiz agree on which answers are correct, and that the security protections have not been removed. If any check fails, the change is flagged before it can reach anyone. On top of those, the finished app is now driven through a full ten-question round in a real browser and every single one of its explanations is checked for something to point at — a class of fault that reads perfectly well as code and only shows itself on screen.</w:t>
       </w:r>
     </w:p>
     <w:p>
@@ -1250,7 +1269,7 @@
           <w:sz w:val="18"/>
           <w:szCs w:val="18"/>
         </w:rPr>
-        <w:t xml:space="preserve">Prepared for FactTree. Two and a half weeks of work, covering seventeen sets of changes across forty-seven files.</w:t>
+        <w:t xml:space="preserve">Prepared for FactTree. Two and a half weeks of work, covering eighteen sets of changes across fifty-three files.</w:t>
       </w:r>
     </w:p>
     <w:sectPr>

</xml_diff>

<commit_message>
Add today's quiz fixes to the report
Corrects the tally to twenty-five fully fixed, and describes the two
highlighting problems a reader would have seen on screen.

Co-Authored-By: Claude Opus 5 <noreply@anthropic.com>
</commit_message>
<xml_diff>
--- a/docs/Spot-the-Scam-Progress-Report.docx
+++ b/docs/Spot-the-Scam-Progress-Report.docx
@@ -491,7 +491,7 @@
           <w:sz w:val="21"/>
           <w:szCs w:val="21"/>
         </w:rPr>
-        <w:t xml:space="preserve">Alongside the new work, the whole codebase was reviewed against a list of twenty-eight known issues. Twenty-six have been fixed. In plain terms, they included:</w:t>
+        <w:t xml:space="preserve">Alongside the new work, the whole codebase was reviewed against a list of twenty-eight known issues. Twenty-five are fully fixed, two are part-done and one was left alone on purpose. In plain terms, they included:</w:t>
       </w:r>
     </w:p>
     <w:p>
@@ -605,6 +605,44 @@
           <w:sz w:val="21"/>
           <w:szCs w:val="21"/>
         </w:rPr>
+        <w:t xml:space="preserve">The same explanation card then landed on top of the message. On the Swiggy example it lit up the shop name in the first line and hid the next two behind itself, so you could not read what was being discussed. It now waits below the whole message.</w:t>
+      </w:r>
+    </w:p>
+    <w:p>
+      <w:pPr>
+        <w:pStyle w:val="ListParagraph"/>
+        <w:numPr>
+          <w:ilvl w:val="0"/>
+          <w:numId w:val="2"/>
+        </w:numPr>
+        <w:spacing w:after="90" w:line="300"/>
+      </w:pPr>
+      <w:r>
+        <w:rPr>
+          <w:rFonts w:ascii="Calibri" w:cs="Calibri" w:eastAsia="Calibri" w:hAnsi="Calibri"/>
+          <w:color w:val="1A1A1A"/>
+          <w:sz w:val="21"/>
+          <w:szCs w:val="21"/>
+        </w:rPr>
+        <w:t xml:space="preserve">Genuine messages were marked up in scam red. Where a message was real, the highlighted parts are the reasons to trust it — the true order number, a bank telling you not to share your code — and they were shaded the same alarm red as a phishing link, right next to a green card explaining why they were reassuring. The colour now follows the verdict.</w:t>
+      </w:r>
+    </w:p>
+    <w:p>
+      <w:pPr>
+        <w:pStyle w:val="ListParagraph"/>
+        <w:numPr>
+          <w:ilvl w:val="0"/>
+          <w:numId w:val="2"/>
+        </w:numPr>
+        <w:spacing w:after="90" w:line="300"/>
+      </w:pPr>
+      <w:r>
+        <w:rPr>
+          <w:rFonts w:ascii="Calibri" w:cs="Calibri" w:eastAsia="Calibri" w:hAnsi="Calibri"/>
+          <w:color w:val="1A1A1A"/>
+          <w:sz w:val="21"/>
+          <w:szCs w:val="21"/>
+        </w:rPr>
         <w:t xml:space="preserve">Roughly a megabyte of unused images being uploaded with every release.</w:t>
       </w:r>
     </w:p>
@@ -619,7 +657,7 @@
           <w:sz w:val="21"/>
           <w:szCs w:val="21"/>
         </w:rPr>
-        <w:t xml:space="preserve">Of the two that remain, one is a piece of unfinished work now brought back in line with the live code and waiting on a translator, and one is a deliberate decision to leave well alone: refreshing the page mid-quiz starts you over, and the fix would cost more than the problem.</w:t>
+        <w:t xml:space="preserve">Of the three not fully closed: one asked for two separate tidy-ups and only the larger half is done; one is unfinished work now brought back in line with the live code and waiting on a translator; and one is a deliberate decision to leave well alone — refreshing the page mid-quiz starts you over, and the fix would cost more than the problem.</w:t>
       </w:r>
     </w:p>
     <w:p>
@@ -664,7 +702,7 @@
           <w:sz w:val="21"/>
           <w:szCs w:val="21"/>
         </w:rPr>
-        <w:t xml:space="preserve">There are now forty-three automated checks that run every single time the code changes. They test the things that fail quietly: that the quiz’s two halves stay equally difficult, that the server and the quiz agree on which answers are correct, and that the security protections have not been removed. If any check fails, the change is flagged before it can reach anyone. On top of those, the finished app is now driven through a full ten-question round in a real browser and every single one of its explanations is checked for something to point at — a class of fault that reads perfectly well as code and only shows itself on screen.</w:t>
+        <w:t xml:space="preserve">There are now forty-three automated checks that run every single time the code changes. They test the things that fail quietly: that the quiz’s two halves stay equally difficult, that the server and the quiz agree on which answers are correct, and that the security protections have not been removed. If any check fails, the change is flagged before it can reach anyone. On top of those, the finished app is now driven through a full ten-question round in a real browser and every single one of its explanations is checked for something to point at, and for not covering the message it explains — a class of fault that reads perfectly well as code and only shows itself on screen.</w:t>
       </w:r>
     </w:p>
     <w:p>
@@ -1269,7 +1307,7 @@
           <w:sz w:val="18"/>
           <w:szCs w:val="18"/>
         </w:rPr>
-        <w:t xml:space="preserve">Prepared for FactTree. Two and a half weeks of work, covering eighteen sets of changes across fifty-three files.</w:t>
+        <w:t xml:space="preserve">Prepared for FactTree. Two and a half weeks of work, covering twenty sets of changes across fifty-five files.</w:t>
       </w:r>
     </w:p>
     <w:sectPr>

</xml_diff>